<commit_message>
job-up: incorporar foto al CV de Grupo Miguel León
</commit_message>
<xml_diff>
--- a/boveda-entrevista-profesional/busqueda-empleo/candidaturas/CAND-2026-012-grupo-miguel-leon-auxiliar-administrativo-secretaria/cv.docx
+++ b/boveda-entrevista-profesional/busqueda-empleo/candidaturas/CAND-2026-012-grupo-miguel-leon-auxiliar-administrativo-secretaria/cv.docx
@@ -2,6 +2,45 @@
 <file path=word/document.xml><?xml version="1.0" encoding="utf-8"?>
 <w:document xmlns:wpc="http://schemas.microsoft.com/office/word/2010/wordprocessingCanvas" xmlns:mo="http://schemas.microsoft.com/office/mac/office/2008/main" xmlns:mc="http://schemas.openxmlformats.org/markup-compatibility/2006" xmlns:mv="urn:schemas-microsoft-com:mac:vml" xmlns:o="urn:schemas-microsoft-com:office:office" xmlns:r="http://schemas.openxmlformats.org/officeDocument/2006/relationships" xmlns:m="http://schemas.openxmlformats.org/officeDocument/2006/math" xmlns:v="urn:schemas-microsoft-com:vml" xmlns:wp14="http://schemas.microsoft.com/office/word/2010/wordprocessingDrawing" xmlns:wp="http://schemas.openxmlformats.org/drawingml/2006/wordprocessingDrawing" xmlns:w10="urn:schemas-microsoft-com:office:word" xmlns:w="http://schemas.openxmlformats.org/wordprocessingml/2006/main" xmlns:w14="http://schemas.microsoft.com/office/word/2010/wordml" xmlns:wpg="http://schemas.microsoft.com/office/word/2010/wordprocessingGroup" xmlns:wpi="http://schemas.microsoft.com/office/word/2010/wordprocessingInk" xmlns:wne="http://schemas.microsoft.com/office/word/2006/wordml" xmlns:wps="http://schemas.microsoft.com/office/word/2010/wordprocessingShape" mc:Ignorable="w14 wp14">
   <w:body>
+    <w:p>
+      <w:pPr>
+        <w:jc w:val="right"/>
+      </w:pPr>
+      <w:r>
+        <w:drawing>
+          <wp:inline xmlns:a="http://schemas.openxmlformats.org/drawingml/2006/main" xmlns:pic="http://schemas.openxmlformats.org/drawingml/2006/picture">
+            <wp:extent cx="868680" cy="868680"/>
+            <wp:docPr id="1" name="Picture 1"/>
+            <wp:cNvGraphicFramePr>
+              <a:graphicFrameLocks noChangeAspect="1"/>
+            </wp:cNvGraphicFramePr>
+            <a:graphic>
+              <a:graphicData uri="http://schemas.openxmlformats.org/drawingml/2006/picture">
+                <pic:pic>
+                  <pic:nvPicPr>
+                    <pic:cNvPr id="0" name="foto-perfil.png"/>
+                    <pic:cNvPicPr/>
+                  </pic:nvPicPr>
+                  <pic:blipFill>
+                    <a:blip r:embed="rId10"/>
+                    <a:stretch>
+                      <a:fillRect/>
+                    </a:stretch>
+                  </pic:blipFill>
+                  <pic:spPr>
+                    <a:xfrm>
+                      <a:off x="0" y="0"/>
+                      <a:ext cx="868680" cy="868680"/>
+                    </a:xfrm>
+                    <a:prstGeom prst="rect"/>
+                  </pic:spPr>
+                </pic:pic>
+              </a:graphicData>
+            </a:graphic>
+          </wp:inline>
+        </w:drawing>
+      </w:r>
+    </w:p>
     <w:p>
       <w:pPr>
         <w:spacing w:after="0"/>

</xml_diff>

<commit_message>
chore: regenerar CV desde template actualizado
</commit_message>
<xml_diff>
--- a/boveda-entrevista-profesional/busqueda-empleo/candidaturas/CAND-2026-012-grupo-miguel-leon-auxiliar-administrativo-secretaria/cv.docx
+++ b/boveda-entrevista-profesional/busqueda-empleo/candidaturas/CAND-2026-012-grupo-miguel-leon-auxiliar-administrativo-secretaria/cv.docx
@@ -17,14 +17,14 @@
         <w:tblLook w:val="04a0" w:firstRow="1" w:noVBand="1" w:lastRow="0" w:firstColumn="1" w:lastColumn="0" w:noHBand="0"/>
       </w:tblPr>
       <w:tblGrid>
-        <w:gridCol w:w="8278"/>
-        <w:gridCol w:w="1802"/>
+        <w:gridCol w:w="8277"/>
+        <w:gridCol w:w="1803"/>
       </w:tblGrid>
       <w:tr>
         <w:trPr/>
         <w:tc>
           <w:tcPr>
-            <w:tcW w:w="8278" w:type="dxa"/>
+            <w:tcW w:w="8277" w:type="dxa"/>
             <w:tcBorders/>
             <w:vAlign w:val="center"/>
           </w:tcPr>
@@ -85,7 +85,7 @@
         </w:tc>
         <w:tc>
           <w:tcPr>
-            <w:tcW w:w="1802" w:type="dxa"/>
+            <w:tcW w:w="1803" w:type="dxa"/>
             <w:tcBorders/>
             <w:vAlign w:val="center"/>
           </w:tcPr>
@@ -157,14 +157,16 @@
         <w:pStyle w:val="Heading1"/>
         <w:spacing w:lineRule="auto" w:line="240" w:before="120" w:after="40"/>
         <w:jc w:val="start"/>
-        <w:rPr/>
+        <w:rPr>
+          <w:color w:val="2A6099"/>
+        </w:rPr>
       </w:pPr>
       <w:r>
         <w:rPr>
           <w:rFonts w:eastAsia="Calibri"/>
           <w:b/>
           <w:i w:val="false"/>
-          <w:color w:val="1F2937"/>
+          <w:color w:val="2A6099"/>
           <w:sz w:val="28"/>
         </w:rPr>
         <w:t>PERFIL PROFESIONAL</w:t>
@@ -193,14 +195,16 @@
         <w:pStyle w:val="Heading1"/>
         <w:spacing w:lineRule="auto" w:line="240" w:before="120" w:after="40"/>
         <w:jc w:val="start"/>
-        <w:rPr/>
+        <w:rPr>
+          <w:color w:val="2A6099"/>
+        </w:rPr>
       </w:pPr>
       <w:r>
         <w:rPr>
           <w:rFonts w:eastAsia="Calibri"/>
           <w:b/>
           <w:i w:val="false"/>
-          <w:color w:val="1F2937"/>
+          <w:color w:val="2A6099"/>
           <w:sz w:val="28"/>
         </w:rPr>
         <w:t>PROPUESTA DE VALOR</w:t>
@@ -229,14 +233,16 @@
         <w:pStyle w:val="Heading1"/>
         <w:spacing w:lineRule="auto" w:line="240" w:before="120" w:after="40"/>
         <w:jc w:val="start"/>
-        <w:rPr/>
+        <w:rPr>
+          <w:color w:val="2A6099"/>
+        </w:rPr>
       </w:pPr>
       <w:r>
         <w:rPr>
           <w:rFonts w:eastAsia="Calibri"/>
           <w:b/>
           <w:i w:val="false"/>
-          <w:color w:val="1F2937"/>
+          <w:color w:val="2A6099"/>
           <w:sz w:val="28"/>
         </w:rPr>
         <w:t>EXPERIENCIA PROFESIONAL RELEVANTE</w:t>
@@ -405,14 +411,16 @@
         <w:pStyle w:val="Heading1"/>
         <w:spacing w:lineRule="auto" w:line="240" w:before="120" w:after="40"/>
         <w:jc w:val="start"/>
-        <w:rPr/>
+        <w:rPr>
+          <w:color w:val="2A6099"/>
+        </w:rPr>
       </w:pPr>
       <w:r>
         <w:rPr>
           <w:rFonts w:eastAsia="Calibri"/>
           <w:b/>
           <w:i w:val="false"/>
-          <w:color w:val="1F2937"/>
+          <w:color w:val="2A6099"/>
           <w:sz w:val="28"/>
         </w:rPr>
         <w:t>COMPETENCIAS Y HERRAMIENTAS</w:t>
@@ -515,14 +523,16 @@
         <w:pStyle w:val="Heading1"/>
         <w:spacing w:lineRule="auto" w:line="240" w:before="120" w:after="40"/>
         <w:jc w:val="start"/>
-        <w:rPr/>
+        <w:rPr>
+          <w:color w:val="2A6099"/>
+        </w:rPr>
       </w:pPr>
       <w:r>
         <w:rPr>
           <w:rFonts w:eastAsia="Calibri"/>
           <w:b/>
           <w:i w:val="false"/>
-          <w:color w:val="1F2937"/>
+          <w:color w:val="2A6099"/>
           <w:sz w:val="28"/>
         </w:rPr>
         <w:t>FORMACIÓN</w:t>
@@ -617,14 +627,16 @@
         <w:pStyle w:val="Heading1"/>
         <w:spacing w:lineRule="auto" w:line="240" w:before="120" w:after="40"/>
         <w:jc w:val="start"/>
-        <w:rPr/>
+        <w:rPr>
+          <w:color w:val="2A6099"/>
+        </w:rPr>
       </w:pPr>
       <w:r>
         <w:rPr>
           <w:rFonts w:eastAsia="Calibri"/>
           <w:b/>
           <w:i w:val="false"/>
-          <w:color w:val="1F2937"/>
+          <w:color w:val="2A6099"/>
           <w:sz w:val="28"/>
         </w:rPr>
         <w:t>INFORMACIÓN ADICIONAL</w:t>
@@ -1917,19 +1929,21 @@
       <w:keepNext w:val="true"/>
       <w:keepLines/>
       <w:pBdr>
-        <w:bottom w:val="single" w:sz="6" w:space="1" w:color="000000"/>
+        <w:bottom w:val="single" w:sz="6" w:space="1" w:color="2A6099"/>
       </w:pBdr>
       <w:spacing w:before="140" w:after="40"/>
-      <w:jc w:val="both"/>
+      <w:jc w:val="start"/>
       <w:outlineLvl w:val="0"/>
     </w:pPr>
     <w:rPr>
       <w:rFonts w:ascii="Calibri" w:hAnsi="Calibri" w:eastAsia="" w:cs="" w:asciiTheme="majorHAnsi" w:cstheme="majorBidi" w:eastAsiaTheme="majorEastAsia" w:hAnsiTheme="majorHAnsi"/>
       <w:b/>
       <w:bCs/>
-      <w:color w:val="1F2937"/>
+      <w:caps/>
+      <w:color w:val="0F4761"/>
       <w:sz w:val="28"/>
       <w:szCs w:val="28"/>
+      <w:u w:val="none" w:color="000000"/>
       <w:lang w:val="es-ES"/>
     </w:rPr>
   </w:style>
@@ -2461,8 +2475,8 @@
       <w:spacing w:val="5"/>
     </w:rPr>
   </w:style>
-  <w:style w:type="character" w:styleId="Bolos">
-    <w:name w:val="Bolos"/>
+  <w:style w:type="character" w:styleId="Bolosuser">
+    <w:name w:val="Bolos (user)"/>
     <w:qFormat/>
     <w:rPr>
       <w:rFonts w:ascii="OpenSymbol" w:hAnsi="OpenSymbol" w:eastAsia="OpenSymbol" w:cs="OpenSymbol"/>
@@ -2565,15 +2579,15 @@
       <w:rFonts w:cs="Lucida Sans"/>
     </w:rPr>
   </w:style>
-  <w:style w:type="paragraph" w:styleId="Cabeceraypieuser">
-    <w:name w:val="Cabecera y pie (user)"/>
+  <w:style w:type="paragraph" w:styleId="Cabeceraypie">
+    <w:name w:val="Cabecera y pie"/>
     <w:basedOn w:val="Normal"/>
     <w:qFormat/>
     <w:pPr/>
     <w:rPr/>
   </w:style>
-  <w:style w:type="paragraph" w:styleId="Cabeceraypie">
-    <w:name w:val="Cabecera y pie"/>
+  <w:style w:type="paragraph" w:styleId="Cabeceraypieuser">
+    <w:name w:val="Cabecera y pie (user)"/>
     <w:basedOn w:val="Normal"/>
     <w:qFormat/>
     <w:pPr/>
@@ -2955,7 +2969,7 @@
   </w:style>
   <w:style w:type="paragraph" w:styleId="IndexHeading">
     <w:name w:val="index heading"/>
-    <w:basedOn w:val="Ttulouser"/>
+    <w:basedOn w:val="Ttulo"/>
     <w:pPr/>
     <w:rPr/>
   </w:style>
@@ -2973,8 +2987,8 @@
     </w:pPr>
     <w:rPr/>
   </w:style>
-  <w:style w:type="numbering" w:styleId="Ningunalistauser" w:default="1">
-    <w:name w:val="Ninguna lista (user)"/>
+  <w:style w:type="numbering" w:styleId="Ningunalista" w:default="1">
+    <w:name w:val="Ninguna lista"/>
     <w:uiPriority w:val="99"/>
     <w:semiHidden/>
     <w:unhideWhenUsed/>

</xml_diff>